<commit_message>
ban list add hg cisitors
</commit_message>
<xml_diff>
--- a/BanList.docx
+++ b/BanList.docx
@@ -1,6 +1,6 @@
 
 <file path=word/document.xml><?xml version="1.0" encoding="utf-8"?>
-<w:document xmlns:wpc="http://schemas.microsoft.com/office/word/2010/wordprocessingCanvas" xmlns:cx="http://schemas.microsoft.com/office/drawing/2014/chartex" xmlns:cx1="http://schemas.microsoft.com/office/drawing/2015/9/8/chartex" xmlns:cx2="http://schemas.microsoft.com/office/drawing/2015/10/21/chartex" xmlns:cx3="http://schemas.microsoft.com/office/drawing/2016/5/9/chartex" xmlns:cx4="http://schemas.microsoft.com/office/drawing/2016/5/10/chartex" xmlns:cx5="http://schemas.microsoft.com/office/drawing/2016/5/11/chartex" xmlns:cx6="http://schemas.microsoft.com/office/drawing/2016/5/12/chartex" xmlns:cx7="http://schemas.microsoft.com/office/drawing/2016/5/13/chartex" xmlns:cx8="http://schemas.microsoft.com/office/drawing/2016/5/14/chartex" xmlns:mc="http://schemas.openxmlformats.org/markup-compatibility/2006" xmlns:aink="http://schemas.microsoft.com/office/drawing/2016/ink" xmlns:am3d="http://schemas.microsoft.com/office/drawing/2017/model3d" xmlns:o="urn:schemas-microsoft-com:office:office" xmlns:oel="http://schemas.microsoft.com/office/2019/extlst" xmlns:r="http://schemas.openxmlformats.org/officeDocument/2006/relationships" xmlns:m="http://schemas.openxmlformats.org/officeDocument/2006/math" xmlns:v="urn:schemas-microsoft-com:vml" xmlns:wp14="http://schemas.microsoft.com/office/word/2010/wordprocessingDrawing" xmlns:wp="http://schemas.openxmlformats.org/drawingml/2006/wordprocessingDrawing" xmlns:w10="urn:schemas-microsoft-com:office:word" xmlns:w="http://schemas.openxmlformats.org/wordprocessingml/2006/main" xmlns:w14="http://schemas.microsoft.com/office/word/2010/wordml" xmlns:w15="http://schemas.microsoft.com/office/word/2012/wordml" xmlns:w16cex="http://schemas.microsoft.com/office/word/2018/wordml/cex" xmlns:w16cid="http://schemas.microsoft.com/office/word/2016/wordml/cid" xmlns:w16="http://schemas.microsoft.com/office/word/2018/wordml" xmlns:w16du="http://schemas.microsoft.com/office/word/2023/wordml/word16du" xmlns:w16sdtdh="http://schemas.microsoft.com/office/word/2020/wordml/sdtdatahash" xmlns:w16se="http://schemas.microsoft.com/office/word/2015/wordml/symex" xmlns:wpg="http://schemas.microsoft.com/office/word/2010/wordprocessingGroup" xmlns:wpi="http://schemas.microsoft.com/office/word/2010/wordprocessingInk" xmlns:wne="http://schemas.microsoft.com/office/word/2006/wordml" xmlns:wps="http://schemas.microsoft.com/office/word/2010/wordprocessingShape" mc:Ignorable="w14 w15 w16se w16cid w16 w16cex w16sdtdh w16du wp14">
+<w:document xmlns:wpc="http://schemas.microsoft.com/office/word/2010/wordprocessingCanvas" xmlns:cx="http://schemas.microsoft.com/office/drawing/2014/chartex" xmlns:cx1="http://schemas.microsoft.com/office/drawing/2015/9/8/chartex" xmlns:cx2="http://schemas.microsoft.com/office/drawing/2015/10/21/chartex" xmlns:cx3="http://schemas.microsoft.com/office/drawing/2016/5/9/chartex" xmlns:cx4="http://schemas.microsoft.com/office/drawing/2016/5/10/chartex" xmlns:cx5="http://schemas.microsoft.com/office/drawing/2016/5/11/chartex" xmlns:cx6="http://schemas.microsoft.com/office/drawing/2016/5/12/chartex" xmlns:cx7="http://schemas.microsoft.com/office/drawing/2016/5/13/chartex" xmlns:cx8="http://schemas.microsoft.com/office/drawing/2016/5/14/chartex" xmlns:mc="http://schemas.openxmlformats.org/markup-compatibility/2006" xmlns:aink="http://schemas.microsoft.com/office/drawing/2016/ink" xmlns:am3d="http://schemas.microsoft.com/office/drawing/2017/model3d" xmlns:o="urn:schemas-microsoft-com:office:office" xmlns:oel="http://schemas.microsoft.com/office/2019/extlst" xmlns:r="http://schemas.openxmlformats.org/officeDocument/2006/relationships" xmlns:m="http://schemas.openxmlformats.org/officeDocument/2006/math" xmlns:v="urn:schemas-microsoft-com:vml" xmlns:wp14="http://schemas.microsoft.com/office/word/2010/wordprocessingDrawing" xmlns:wp="http://schemas.openxmlformats.org/drawingml/2006/wordprocessingDrawing" xmlns:w10="urn:schemas-microsoft-com:office:word" xmlns:w="http://schemas.openxmlformats.org/wordprocessingml/2006/main" xmlns:w14="http://schemas.microsoft.com/office/word/2010/wordml" xmlns:w15="http://schemas.microsoft.com/office/word/2012/wordml" xmlns:w16cex="http://schemas.microsoft.com/office/word/2018/wordml/cex" xmlns:w16cid="http://schemas.microsoft.com/office/word/2016/wordml/cid" xmlns:w16="http://schemas.microsoft.com/office/word/2018/wordml" xmlns:w16du="http://schemas.microsoft.com/office/word/2023/wordml/word16du" xmlns:w16sdtdh="http://schemas.microsoft.com/office/word/2020/wordml/sdtdatahash" xmlns:w16sdtfl="http://schemas.microsoft.com/office/word/2024/wordml/sdtformatlock" xmlns:w16se="http://schemas.microsoft.com/office/word/2015/wordml/symex" xmlns:wpg="http://schemas.microsoft.com/office/word/2010/wordprocessingGroup" xmlns:wpi="http://schemas.microsoft.com/office/word/2010/wordprocessingInk" xmlns:wne="http://schemas.microsoft.com/office/word/2006/wordml" xmlns:wps="http://schemas.microsoft.com/office/word/2010/wordprocessingShape" mc:Ignorable="w14 w15 w16se w16cid w16 w16cex w16sdtdh w16sdtfl w16du wp14">
   <w:body>
     <w:p>
       <w:pPr>
@@ -292,9 +292,10 @@
     </w:p>
     <w:p>
       <w:r>
-        <w:br w:type="page"/>
-      </w:r>
-    </w:p>
+        <w:t xml:space="preserve"> </w:t>
+      </w:r>
+    </w:p>
+    <w:p/>
     <w:p>
       <w:pPr>
         <w:pStyle w:val="Heading2"/>
@@ -465,15 +466,7 @@
         </w:r>
       </w:hyperlink>
       <w:r>
-        <w:t xml:space="preserve">. The “http://” and </w:t>
-      </w:r>
-      <w:proofErr w:type="gramStart"/>
-      <w:r>
-        <w:t>“:port</w:t>
-      </w:r>
-      <w:proofErr w:type="gramEnd"/>
-      <w:r>
-        <w:t xml:space="preserve">” number is </w:t>
+        <w:t xml:space="preserve">. The “http://” and “:port” number is </w:t>
       </w:r>
       <w:r>
         <w:t>needed</w:t>
@@ -503,15 +496,7 @@
         </w:r>
       </w:hyperlink>
       <w:r>
-        <w:t xml:space="preserve">. The “http://” and </w:t>
-      </w:r>
-      <w:proofErr w:type="gramStart"/>
-      <w:r>
-        <w:t>“:port</w:t>
-      </w:r>
-      <w:proofErr w:type="gramEnd"/>
-      <w:r>
-        <w:t xml:space="preserve">” number is </w:t>
+        <w:t xml:space="preserve">. The “http://” and “:port” number is </w:t>
       </w:r>
       <w:r>
         <w:t>needed</w:t>
@@ -589,7 +574,6 @@
       <w:r>
         <w:t>MAC address from the robust log: “</w:t>
       </w:r>
-      <w:proofErr w:type="gramStart"/>
       <w:r>
         <w:rPr>
           <w:b/>
@@ -602,33 +586,210 @@
           <w:b/>
           <w:bCs/>
         </w:rPr>
-        <w:t>d</w:t>
+        <w:t>d5af8bee7e6a265c41e729416d570f57</w:t>
+      </w:r>
+      <w:r>
+        <w:t xml:space="preserve">”.    </w:t>
+      </w:r>
+    </w:p>
+    <w:p>
+      <w:pPr>
+        <w:pStyle w:val="Heading2"/>
+      </w:pPr>
+      <w:r>
+        <w:t>Viewer Ban</w:t>
+      </w:r>
+    </w:p>
+    <w:p>
+      <w:r>
+        <w:t xml:space="preserve">To ban a specific viewer, add the name and Revision. “Firestorm-Releasex64 5.2.8.58205”.  To ban all version 5 Firestorms, add “Firestorm-Releasex64 5”. </w:t>
+      </w:r>
+    </w:p>
+    <w:p>
+      <w:pPr>
+        <w:pStyle w:val="Heading2"/>
+      </w:pPr>
+      <w:r>
+        <w:t>IP Bans</w:t>
+      </w:r>
+      <w:r>
+        <w:t xml:space="preserve"> </w:t>
+      </w:r>
+    </w:p>
+    <w:p>
+      <w:r>
+        <w:t>IP Bans work at the firewall level.  Bad people can't reach or touch anything.</w:t>
+      </w:r>
+    </w:p>
+    <w:p/>
+    <w:p>
+      <w:pPr>
+        <w:pStyle w:val="Heading2"/>
+      </w:pPr>
+      <w:r>
+        <w:rPr>
+          <w:rStyle w:val="Heading2Char"/>
+        </w:rPr>
+        <w:lastRenderedPageBreak/>
+        <w:t>Hypergrid</w:t>
+      </w:r>
+      <w:r>
+        <w:t xml:space="preserve"> </w:t>
+      </w:r>
+      <w:r>
+        <w:rPr>
+          <w:rStyle w:val="Heading2Char"/>
+        </w:rPr>
+        <w:t>visitors</w:t>
+      </w:r>
+    </w:p>
+    <w:p>
+      <w:r>
+        <w:t>1.</w:t>
+      </w:r>
+      <w:r>
+        <w:tab/>
+        <w:t xml:space="preserve">Opensim can't ban Hypergrid visitors by name. </w:t>
+      </w:r>
+      <w:r>
+        <w:t xml:space="preserve">But DreamGrid </w:t>
+      </w:r>
+      <w:r>
+        <w:t>can</w:t>
+      </w:r>
+      <w:r>
+        <w:t xml:space="preserve">. </w:t>
+      </w:r>
+      <w:r>
+        <w:t>Now the avatar scan kicks the visitor. About once a second DreamGrid checks who is online. A Hypergrid visitor whose name is on the ban list is kicked with "You are banned from this grid."</w:t>
+      </w:r>
+    </w:p>
+    <w:p>
+      <w:r>
+        <w:t xml:space="preserve">   - If they come back, they are kicked again, at most once a minute.</w:t>
+      </w:r>
+    </w:p>
+    <w:p>
+      <w:r>
+        <w:t xml:space="preserve">   - They aren't counted or announced as arriving.</w:t>
+      </w:r>
+    </w:p>
+    <w:p>
+      <w:r>
+        <w:t xml:space="preserve">   - Each kick is written </w:t>
+      </w:r>
+      <w:proofErr w:type="gramStart"/>
+      <w:r>
+        <w:t>to</w:t>
       </w:r>
       <w:proofErr w:type="gramEnd"/>
       <w:r>
-        <w:rPr>
-          <w:b/>
-          <w:bCs/>
-        </w:rPr>
-        <w:t>5af8bee7e6a265c41e729416d570f57</w:t>
-      </w:r>
-      <w:r>
-        <w:t xml:space="preserve">”.    </w:t>
-      </w:r>
-    </w:p>
-    <w:p>
-      <w:pPr>
-        <w:pStyle w:val="Heading2"/>
-      </w:pPr>
-      <w:r>
-        <w:t>Viewer Ban</w:t>
-      </w:r>
-    </w:p>
-    <w:p>
-      <w:r>
-        <w:t xml:space="preserve">To ban a specific viewer, add the name and Revision. “Firestorm-Releasex64 5.2.8.58205”.  To ban all version 5 Firestorms, add “Firestorm-Releasex64 5”. </w:t>
-      </w:r>
-    </w:p>
+        <w:t xml:space="preserve"> the log and </w:t>
+      </w:r>
+      <w:proofErr w:type="gramStart"/>
+      <w:r>
+        <w:t>to</w:t>
+      </w:r>
+      <w:proofErr w:type="gramEnd"/>
+      <w:r>
+        <w:t xml:space="preserve"> Error.log.</w:t>
+      </w:r>
+    </w:p>
+    <w:p>
+      <w:r>
+        <w:t>2. Ways to add the avatar to the Ban list (</w:t>
+      </w:r>
+      <w:proofErr w:type="gramStart"/>
+      <w:r>
+        <w:t>all of</w:t>
+      </w:r>
+      <w:proofErr w:type="gramEnd"/>
+      <w:r>
+        <w:t xml:space="preserve"> </w:t>
+      </w:r>
+      <w:proofErr w:type="gramStart"/>
+      <w:r>
+        <w:t>these</w:t>
+      </w:r>
+      <w:proofErr w:type="gramEnd"/>
+      <w:r>
+        <w:t xml:space="preserve"> work):</w:t>
+      </w:r>
+    </w:p>
+    <w:p>
+      <w:r>
+        <w:t xml:space="preserve">   - </w:t>
+      </w:r>
+      <w:proofErr w:type="spellStart"/>
+      <w:r>
+        <w:t>Ann.</w:t>
+      </w:r>
+      <w:proofErr w:type="gramStart"/>
+      <w:r>
+        <w:t>Lee</w:t>
+      </w:r>
+      <w:proofErr w:type="spellEnd"/>
+      <w:r>
+        <w:t xml:space="preserve"> @</w:t>
+      </w:r>
+      <w:proofErr w:type="gramEnd"/>
+      <w:r>
+        <w:t>grid.com:8002</w:t>
+      </w:r>
+    </w:p>
+    <w:p>
+      <w:r>
+        <w:t xml:space="preserve">   - Ann.Lee@grid.com:8002</w:t>
+      </w:r>
+    </w:p>
+    <w:p>
+      <w:r>
+        <w:t xml:space="preserve">   - </w:t>
+      </w:r>
+      <w:proofErr w:type="spellStart"/>
+      <w:r>
+        <w:t>Ann.</w:t>
+      </w:r>
+      <w:proofErr w:type="gramStart"/>
+      <w:r>
+        <w:t>Lee</w:t>
+      </w:r>
+      <w:proofErr w:type="spellEnd"/>
+      <w:r>
+        <w:t xml:space="preserve"> @</w:t>
+      </w:r>
+      <w:proofErr w:type="gramEnd"/>
+      <w:r>
+        <w:t xml:space="preserve"> http://grid.com:8002/</w:t>
+      </w:r>
+    </w:p>
+    <w:p>
+      <w:r>
+        <w:t xml:space="preserve">   - With no port (</w:t>
+      </w:r>
+      <w:proofErr w:type="spellStart"/>
+      <w:r>
+        <w:t>Ann.</w:t>
+      </w:r>
+      <w:proofErr w:type="gramStart"/>
+      <w:r>
+        <w:t>Lee</w:t>
+      </w:r>
+      <w:proofErr w:type="spellEnd"/>
+      <w:r>
+        <w:t xml:space="preserve"> @</w:t>
+      </w:r>
+      <w:proofErr w:type="gramEnd"/>
+      <w:r>
+        <w:t>grid.com), the name is banned on every port of that host.</w:t>
+      </w:r>
+    </w:p>
+    <w:p>
+      <w:r>
+        <w:t>3. Edits work at once. The list is read again when it changes, without a Robust restart.</w:t>
+      </w:r>
+    </w:p>
+    <w:p/>
     <w:p>
       <w:pPr>
         <w:pStyle w:val="Heading2"/>
@@ -681,15 +842,7 @@
       <w:r>
         <w:t>There is a Analyze Log button in the Log settings that will show you all MAC and Disk ID0’s that were seen.</w:t>
       </w:r>
-    </w:p>
-    <w:bookmarkEnd w:id="0"/>
-    <w:p>
-      <w:pPr>
-        <w:rPr>
-          <w:rFonts w:ascii="Times New Roman" w:hAnsi="Times New Roman"/>
-          <w:strike/>
-        </w:rPr>
-      </w:pPr>
+      <w:bookmarkEnd w:id="0"/>
     </w:p>
     <w:sectPr>
       <w:pgSz w:w="12240" w:h="15840"/>
@@ -702,7 +855,7 @@
 </file>
 
 <file path=word/numbering.xml><?xml version="1.0" encoding="utf-8"?>
-<w:numbering xmlns:wpc="http://schemas.microsoft.com/office/word/2010/wordprocessingCanvas" xmlns:cx="http://schemas.microsoft.com/office/drawing/2014/chartex" xmlns:cx1="http://schemas.microsoft.com/office/drawing/2015/9/8/chartex" xmlns:cx2="http://schemas.microsoft.com/office/drawing/2015/10/21/chartex" xmlns:cx3="http://schemas.microsoft.com/office/drawing/2016/5/9/chartex" xmlns:cx4="http://schemas.microsoft.com/office/drawing/2016/5/10/chartex" xmlns:cx5="http://schemas.microsoft.com/office/drawing/2016/5/11/chartex" xmlns:cx6="http://schemas.microsoft.com/office/drawing/2016/5/12/chartex" xmlns:cx7="http://schemas.microsoft.com/office/drawing/2016/5/13/chartex" xmlns:cx8="http://schemas.microsoft.com/office/drawing/2016/5/14/chartex" xmlns:mc="http://schemas.openxmlformats.org/markup-compatibility/2006" xmlns:aink="http://schemas.microsoft.com/office/drawing/2016/ink" xmlns:am3d="http://schemas.microsoft.com/office/drawing/2017/model3d" xmlns:o="urn:schemas-microsoft-com:office:office" xmlns:oel="http://schemas.microsoft.com/office/2019/extlst" xmlns:r="http://schemas.openxmlformats.org/officeDocument/2006/relationships" xmlns:m="http://schemas.openxmlformats.org/officeDocument/2006/math" xmlns:v="urn:schemas-microsoft-com:vml" xmlns:wp14="http://schemas.microsoft.com/office/word/2010/wordprocessingDrawing" xmlns:wp="http://schemas.openxmlformats.org/drawingml/2006/wordprocessingDrawing" xmlns:w10="urn:schemas-microsoft-com:office:word" xmlns:w="http://schemas.openxmlformats.org/wordprocessingml/2006/main" xmlns:w14="http://schemas.microsoft.com/office/word/2010/wordml" xmlns:w15="http://schemas.microsoft.com/office/word/2012/wordml" xmlns:w16cex="http://schemas.microsoft.com/office/word/2018/wordml/cex" xmlns:w16cid="http://schemas.microsoft.com/office/word/2016/wordml/cid" xmlns:w16="http://schemas.microsoft.com/office/word/2018/wordml" xmlns:w16du="http://schemas.microsoft.com/office/word/2023/wordml/word16du" xmlns:w16sdtdh="http://schemas.microsoft.com/office/word/2020/wordml/sdtdatahash" xmlns:w16se="http://schemas.microsoft.com/office/word/2015/wordml/symex" xmlns:wpg="http://schemas.microsoft.com/office/word/2010/wordprocessingGroup" xmlns:wpi="http://schemas.microsoft.com/office/word/2010/wordprocessingInk" xmlns:wne="http://schemas.microsoft.com/office/word/2006/wordml" xmlns:wps="http://schemas.microsoft.com/office/word/2010/wordprocessingShape" mc:Ignorable="w14 w15 w16se w16cid w16 w16cex w16sdtdh w16du wp14">
+<w:numbering xmlns:wpc="http://schemas.microsoft.com/office/word/2010/wordprocessingCanvas" xmlns:cx="http://schemas.microsoft.com/office/drawing/2014/chartex" xmlns:cx1="http://schemas.microsoft.com/office/drawing/2015/9/8/chartex" xmlns:cx2="http://schemas.microsoft.com/office/drawing/2015/10/21/chartex" xmlns:cx3="http://schemas.microsoft.com/office/drawing/2016/5/9/chartex" xmlns:cx4="http://schemas.microsoft.com/office/drawing/2016/5/10/chartex" xmlns:cx5="http://schemas.microsoft.com/office/drawing/2016/5/11/chartex" xmlns:cx6="http://schemas.microsoft.com/office/drawing/2016/5/12/chartex" xmlns:cx7="http://schemas.microsoft.com/office/drawing/2016/5/13/chartex" xmlns:cx8="http://schemas.microsoft.com/office/drawing/2016/5/14/chartex" xmlns:mc="http://schemas.openxmlformats.org/markup-compatibility/2006" xmlns:aink="http://schemas.microsoft.com/office/drawing/2016/ink" xmlns:am3d="http://schemas.microsoft.com/office/drawing/2017/model3d" xmlns:o="urn:schemas-microsoft-com:office:office" xmlns:oel="http://schemas.microsoft.com/office/2019/extlst" xmlns:r="http://schemas.openxmlformats.org/officeDocument/2006/relationships" xmlns:m="http://schemas.openxmlformats.org/officeDocument/2006/math" xmlns:v="urn:schemas-microsoft-com:vml" xmlns:wp14="http://schemas.microsoft.com/office/word/2010/wordprocessingDrawing" xmlns:wp="http://schemas.openxmlformats.org/drawingml/2006/wordprocessingDrawing" xmlns:w10="urn:schemas-microsoft-com:office:word" xmlns:w="http://schemas.openxmlformats.org/wordprocessingml/2006/main" xmlns:w14="http://schemas.microsoft.com/office/word/2010/wordml" xmlns:w15="http://schemas.microsoft.com/office/word/2012/wordml" xmlns:w16cex="http://schemas.microsoft.com/office/word/2018/wordml/cex" xmlns:w16cid="http://schemas.microsoft.com/office/word/2016/wordml/cid" xmlns:w16="http://schemas.microsoft.com/office/word/2018/wordml" xmlns:w16du="http://schemas.microsoft.com/office/word/2023/wordml/word16du" xmlns:w16sdtdh="http://schemas.microsoft.com/office/word/2020/wordml/sdtdatahash" xmlns:w16sdtfl="http://schemas.microsoft.com/office/word/2024/wordml/sdtformatlock" xmlns:w16se="http://schemas.microsoft.com/office/word/2015/wordml/symex" xmlns:wpg="http://schemas.microsoft.com/office/word/2010/wordprocessingGroup" xmlns:wpi="http://schemas.microsoft.com/office/word/2010/wordprocessingInk" xmlns:wne="http://schemas.microsoft.com/office/word/2006/wordml" xmlns:wps="http://schemas.microsoft.com/office/word/2010/wordprocessingShape" mc:Ignorable="w14 w15 w16se w16cid w16 w16cex w16sdtdh w16sdtfl w16du wp14">
   <w:abstractNum w:abstractNumId="0" w15:restartNumberingAfterBreak="0">
     <w:nsid w:val="062432AE"/>
     <w:multiLevelType w:val="hybridMultilevel"/>
@@ -823,7 +976,7 @@
 </file>
 
 <file path=word/styles.xml><?xml version="1.0" encoding="utf-8"?>
-<w:styles xmlns:mc="http://schemas.openxmlformats.org/markup-compatibility/2006" xmlns:r="http://schemas.openxmlformats.org/officeDocument/2006/relationships" xmlns:w="http://schemas.openxmlformats.org/wordprocessingml/2006/main" xmlns:w14="http://schemas.microsoft.com/office/word/2010/wordml" xmlns:w15="http://schemas.microsoft.com/office/word/2012/wordml" xmlns:w16cex="http://schemas.microsoft.com/office/word/2018/wordml/cex" xmlns:w16cid="http://schemas.microsoft.com/office/word/2016/wordml/cid" xmlns:w16="http://schemas.microsoft.com/office/word/2018/wordml" xmlns:w16du="http://schemas.microsoft.com/office/word/2023/wordml/word16du" xmlns:w16sdtdh="http://schemas.microsoft.com/office/word/2020/wordml/sdtdatahash" xmlns:w16se="http://schemas.microsoft.com/office/word/2015/wordml/symex" mc:Ignorable="w14 w15 w16se w16cid w16 w16cex w16sdtdh w16du">
+<w:styles xmlns:mc="http://schemas.openxmlformats.org/markup-compatibility/2006" xmlns:r="http://schemas.openxmlformats.org/officeDocument/2006/relationships" xmlns:w="http://schemas.openxmlformats.org/wordprocessingml/2006/main" xmlns:w14="http://schemas.microsoft.com/office/word/2010/wordml" xmlns:w15="http://schemas.microsoft.com/office/word/2012/wordml" xmlns:w16cex="http://schemas.microsoft.com/office/word/2018/wordml/cex" xmlns:w16cid="http://schemas.microsoft.com/office/word/2016/wordml/cid" xmlns:w16="http://schemas.microsoft.com/office/word/2018/wordml" xmlns:w16du="http://schemas.microsoft.com/office/word/2023/wordml/word16du" xmlns:w16sdtdh="http://schemas.microsoft.com/office/word/2020/wordml/sdtdatahash" xmlns:w16sdtfl="http://schemas.microsoft.com/office/word/2024/wordml/sdtformatlock" xmlns:w16se="http://schemas.microsoft.com/office/word/2015/wordml/symex" mc:Ignorable="w14 w15 w16se w16cid w16 w16cex w16sdtdh w16sdtfl w16du">
   <w:docDefaults>
     <w:rPrDefault>
       <w:rPr>
@@ -1433,7 +1586,6 @@
   <w:style w:type="character" w:default="1" w:styleId="DefaultParagraphFont">
     <w:name w:val="Default Paragraph Font"/>
     <w:uiPriority w:val="1"/>
-    <w:semiHidden/>
     <w:unhideWhenUsed/>
   </w:style>
   <w:style w:type="table" w:default="1" w:styleId="TableNormal">

</xml_diff>